<commit_message>
feat: interleave YouTube captures with Gemini visuals
</commit_message>
<xml_diff>
--- a/blog/manuals/브링이슈_유튜브_콘텐츠_운영_매뉴얼_v1.0.docx
+++ b/blog/manuals/브링이슈_유튜브_콘텐츠_운영_매뉴얼_v1.0.docx
@@ -8154,6 +8154,81 @@
         <w:tblInd w:w="120" w:type="dxa"/>
       </w:tblPr>
       <w:tblGrid>
+        <w:gridCol w:w="9360"/>
+      </w:tblGrid>
+      <w:tr>
+        <w:trPr>
+          <w:cantSplit/>
+        </w:trPr>
+        <w:tc>
+          <w:tcPr>
+            <w:tcW w:type="dxa" w:w="9360"/>
+            <w:tcMar>
+              <w:top w:w="80" w:type="dxa"/>
+              <w:start w:w="120" w:type="dxa"/>
+              <w:bottom w:w="80" w:type="dxa"/>
+              <w:end w:w="120" w:type="dxa"/>
+            </w:tcMar>
+            <w:tcBorders>
+              <w:top w:val="single" w:sz="4" w:color="CBD5E1"/>
+              <w:left w:val="single" w:sz="4" w:color="CBD5E1"/>
+              <w:bottom w:val="single" w:sz="4" w:color="CBD5E1"/>
+              <w:right w:val="single" w:sz="4" w:color="CBD5E1"/>
+              <w:insideH w:val="single" w:sz="4" w:color="CBD5E1"/>
+              <w:insideV w:val="single" w:sz="4" w:color="CBD5E1"/>
+            </w:tcBorders>
+            <w:vAlign w:val="center"/>
+            <w:shd w:fill="FFF4CC"/>
+          </w:tcPr>
+          <w:p>
+            <w:pPr>
+              <w:spacing w:after="40"/>
+            </w:pPr>
+            <w:r>
+              <w:rPr>
+                <w:rFonts w:ascii="Calibri" w:hAnsi="Calibri" w:eastAsia="Malgun Gothic"/>
+                <w:b/>
+                <w:i w:val="0"/>
+                <w:color w:val="18324A"/>
+                <w:sz w:val="21"/>
+                <w:u w:val="none"/>
+              </w:rPr>
+              <w:t>고정 교차 편집 순서</w:t>
+            </w:r>
+          </w:p>
+          <w:p>
+            <w:pPr>
+              <w:spacing w:after="0"/>
+            </w:pPr>
+            <w:r>
+              <w:rPr>
+                <w:rFonts w:ascii="Calibri" w:hAnsi="Calibri" w:eastAsia="Malgun Gothic"/>
+                <w:b w:val="0"/>
+                <w:i w:val="0"/>
+                <w:color w:val="111827"/>
+                <w:sz w:val="21"/>
+                <w:u w:val="none"/>
+              </w:rPr>
+              <w:t>유튜브 고화질 캡처 → 장면 설명 → 제미나이 이해 이미지 → 해설</w:t>
+            </w:r>
+          </w:p>
+        </w:tc>
+      </w:tr>
+    </w:tbl>
+    <w:p>
+      <w:pPr>
+        <w:spacing w:after="20"/>
+      </w:pPr>
+    </w:p>
+    <w:tbl>
+      <w:tblPr>
+        <w:tblW w:type="dxa" w:w="9360"/>
+        <w:jc w:val="left"/>
+        <w:tblLayout w:type="fixed"/>
+        <w:tblLook w:firstColumn="1" w:firstRow="1" w:lastColumn="0" w:lastRow="0" w:noHBand="0" w:noVBand="1" w:val="04A0"/>
+        <w:tblInd w:w="120" w:type="dxa"/>
+      </w:tblPr>
+      <w:tblGrid>
         <w:gridCol w:w="1400"/>
         <w:gridCol w:w="3930"/>
         <w:gridCol w:w="4030"/>
@@ -8885,7 +8960,63 @@
           <w:sz w:val="21"/>
           <w:u w:val="none"/>
         </w:rPr>
+        <w:t>제미나이 이미지를 연속으로 배치하지 않고, 앞이나 뒤에 실제 영상 캡처와 설명 문단을 둔다.</w:t>
+      </w:r>
+    </w:p>
+    <w:p>
+      <w:pPr>
+        <w:spacing w:after="80"/>
+        <w:ind w:left="259" w:hanging="259"/>
+      </w:pPr>
+      <w:r>
+        <w:rPr>
+          <w:rFonts w:ascii="Calibri" w:hAnsi="Calibri" w:eastAsia="Malgun Gothic"/>
+          <w:b/>
+          <w:i w:val="0"/>
+          <w:color w:val="4F81BD"/>
+          <w:sz w:val="22"/>
+          <w:u w:val="none"/>
+        </w:rPr>
+        <w:t xml:space="preserve">☐  </w:t>
+      </w:r>
+      <w:r>
+        <w:rPr>
+          <w:rFonts w:ascii="Calibri" w:hAnsi="Calibri" w:eastAsia="Malgun Gothic"/>
+          <w:b w:val="0"/>
+          <w:i w:val="0"/>
+          <w:color w:val="111827"/>
+          <w:sz w:val="21"/>
+          <w:u w:val="none"/>
+        </w:rPr>
         <w:t>모든 AI 이미지 아래에 ‘AI로 제작한 이해용 이미지입니다.’라고 표시한다.</w:t>
+      </w:r>
+    </w:p>
+    <w:p>
+      <w:pPr>
+        <w:spacing w:after="80"/>
+        <w:ind w:left="259" w:hanging="259"/>
+      </w:pPr>
+      <w:r>
+        <w:rPr>
+          <w:rFonts w:ascii="Calibri" w:hAnsi="Calibri" w:eastAsia="Malgun Gothic"/>
+          <w:b/>
+          <w:i w:val="0"/>
+          <w:color w:val="4F81BD"/>
+          <w:sz w:val="22"/>
+          <w:u w:val="none"/>
+        </w:rPr>
+        <w:t xml:space="preserve">☐  </w:t>
+      </w:r>
+      <w:r>
+        <w:rPr>
+          <w:rFonts w:ascii="Calibri" w:hAnsi="Calibri" w:eastAsia="Malgun Gothic"/>
+          <w:b w:val="0"/>
+          <w:i w:val="0"/>
+          <w:color w:val="111827"/>
+          <w:sz w:val="21"/>
+          <w:u w:val="none"/>
+        </w:rPr>
+        <w:t>모든 실제 캡처 아래에 ‘영상 캡처: 원본 YouTube 영상 (화면 UI 제거·내용 확인용)’이라고 표시한다.</w:t>
       </w:r>
     </w:p>
     <w:tbl>
@@ -9565,19 +9696,23 @@
               <w:br/>
               <w:t>[이모지 소제목] 시작과 배경</w:t>
               <w:br/>
-              <w:t>[사실 + 실제 장면 + 해설]</w:t>
+              <w:t>[유튜브 고화질 캡처]</w:t>
+              <w:br/>
+              <w:t>영상 캡처: 원본 YouTube 영상 (화면 UI 제거·내용 확인용)</w:t>
+              <w:br/>
+              <w:t>[캡처에 보이는 사실과 장면 설명]</w:t>
               <w:br/>
               <w:br/>
               <w:t>[제미나이 이해 이미지]</w:t>
               <w:br/>
               <w:t>AI로 제작한 이해용 이미지입니다.</w:t>
               <w:br/>
-              <w:t>[이미지가 설명하는 배경·감정]</w:t>
+              <w:t>[이미지가 보완하는 배경·감정 해설]</w:t>
               <w:br/>
               <w:br/>
               <w:t>[이모지 소제목] 복선</w:t>
               <w:br/>
-              <w:t>[사실 + 실제 장면]</w:t>
+              <w:t>[실제 캡처 + 설명 + 해설]</w:t>
               <w:br/>
               <w:br/>
               <w:t>[네이버 구분선]</w:t>
@@ -11434,6 +11569,26 @@
           <w:u w:val="none"/>
         </w:rPr>
         <w:t>모든 제미나이 이미지 아래에 ‘AI로 제작한 이해용 이미지입니다.’ 캡션을 입력한다.</w:t>
+      </w:r>
+    </w:p>
+    <w:p>
+      <w:pPr>
+        <w:numPr>
+          <w:ilvl w:val="0"/>
+          <w:numId w:val="12"/>
+        </w:numPr>
+        <w:spacing w:after="80" w:line="300" w:lineRule="auto"/>
+      </w:pPr>
+      <w:r>
+        <w:rPr>
+          <w:rFonts w:ascii="Calibri" w:hAnsi="Calibri" w:eastAsia="Malgun Gothic"/>
+          <w:b w:val="0"/>
+          <w:i w:val="0"/>
+          <w:color w:val="111827"/>
+          <w:sz w:val="22"/>
+          <w:u w:val="none"/>
+        </w:rPr>
+        <w:t>실제 캡처와 제미나이 이미지를 교차 배치하고 각 이미지 아래에 서로 다른 출처·AI 고지를 입력한다.</w:t>
       </w:r>
     </w:p>
     <w:p>
@@ -18445,6 +18600,62 @@
           <w:sz w:val="21"/>
           <w:u w:val="none"/>
         </w:rPr>
+        <w:t>실제 영상 캡처가 각 핵심 구간의 증거로 배치되고 ‘영상 캡처: 원본 YouTube 영상’ 표기가 있다.</w:t>
+      </w:r>
+    </w:p>
+    <w:p>
+      <w:pPr>
+        <w:spacing w:after="80"/>
+        <w:ind w:left="259" w:hanging="259"/>
+      </w:pPr>
+      <w:r>
+        <w:rPr>
+          <w:rFonts w:ascii="Calibri" w:hAnsi="Calibri" w:eastAsia="Malgun Gothic"/>
+          <w:b/>
+          <w:i w:val="0"/>
+          <w:color w:val="4F81BD"/>
+          <w:sz w:val="22"/>
+          <w:u w:val="none"/>
+        </w:rPr>
+        <w:t xml:space="preserve">☐  </w:t>
+      </w:r>
+      <w:r>
+        <w:rPr>
+          <w:rFonts w:ascii="Calibri" w:hAnsi="Calibri" w:eastAsia="Malgun Gothic"/>
+          <w:b w:val="0"/>
+          <w:i w:val="0"/>
+          <w:color w:val="111827"/>
+          <w:sz w:val="21"/>
+          <w:u w:val="none"/>
+        </w:rPr>
+        <w:t>제미나이 이미지를 연속으로 배치하지 않았고 실제 캡처와 해설 문단 사이에 교차 배치했다.</w:t>
+      </w:r>
+    </w:p>
+    <w:p>
+      <w:pPr>
+        <w:spacing w:after="80"/>
+        <w:ind w:left="259" w:hanging="259"/>
+      </w:pPr>
+      <w:r>
+        <w:rPr>
+          <w:rFonts w:ascii="Calibri" w:hAnsi="Calibri" w:eastAsia="Malgun Gothic"/>
+          <w:b/>
+          <w:i w:val="0"/>
+          <w:color w:val="4F81BD"/>
+          <w:sz w:val="22"/>
+          <w:u w:val="none"/>
+        </w:rPr>
+        <w:t xml:space="preserve">☐  </w:t>
+      </w:r>
+      <w:r>
+        <w:rPr>
+          <w:rFonts w:ascii="Calibri" w:hAnsi="Calibri" w:eastAsia="Malgun Gothic"/>
+          <w:b w:val="0"/>
+          <w:i w:val="0"/>
+          <w:color w:val="111827"/>
+          <w:sz w:val="21"/>
+          <w:u w:val="none"/>
+        </w:rPr>
         <w:t>제미나이 이미지가 1200×675px 이상이며 얼굴 복제·깨진 글자·로고·워터마크가 없다.</w:t>
       </w:r>
     </w:p>

</xml_diff>